<commit_message>
Fix Open in MATLAB Online badge deep link; renumber steps 1-11
</commit_message>
<xml_diff>
--- a/workshop instruction/WS1 - Battery State Controller with Stateflow and Code Generation for Arduino_en.docx
+++ b/workshop instruction/WS1 - Battery State Controller with Stateflow and Code Generation for Arduino_en.docx
@@ -883,7 +883,7 @@
         <w:rPr>
           <w:rFonts w:ascii="Calibri" w:hAnsi="Calibri"/>
         </w:rPr>
-        <w:t>3. Toolbox Verification (Step 0, ~10 min)</w:t>
+        <w:t>3. Toolbox Verification (Step 1, ~10 min)</w:t>
       </w:r>
     </w:p>
     <w:p>
@@ -1387,7 +1387,7 @@
         <w:rPr>
           <w:rFonts w:ascii="Calibri" w:hAnsi="Calibri"/>
         </w:rPr>
-        <w:t>4. Open the Starter Model (Step 1, ~5 min)</w:t>
+        <w:t>4. Open the Starter Model (Step 2, ~5 min)</w:t>
       </w:r>
     </w:p>
     <w:p>
@@ -1761,7 +1761,7 @@
         <w:rPr>
           <w:rFonts w:ascii="Calibri" w:hAnsi="Calibri"/>
         </w:rPr>
-        <w:t>5. Build the Stateflow Chart (Steps 2–6, ~40 min)</w:t>
+        <w:t>5. Build the Stateflow Chart (Steps 3–7, ~40 min)</w:t>
       </w:r>
     </w:p>
     <w:p>
@@ -1789,7 +1789,7 @@
         <w:rPr>
           <w:rFonts w:ascii="Calibri" w:hAnsi="Calibri"/>
         </w:rPr>
-        <w:t>Step 2: Add the four states</w:t>
+        <w:t>Step 3: Add the four states</w:t>
       </w:r>
     </w:p>
     <w:p>
@@ -2046,7 +2046,7 @@
         <w:rPr>
           <w:rFonts w:ascii="Calibri" w:hAnsi="Calibri"/>
         </w:rPr>
-        <w:t>Step 3: Add `during` actions to each state</w:t>
+        <w:t>Step 4: Add `during` actions to each state</w:t>
       </w:r>
     </w:p>
     <w:p>
@@ -2293,7 +2293,7 @@
         <w:rPr>
           <w:rFonts w:ascii="Calibri" w:hAnsi="Calibri"/>
         </w:rPr>
-        <w:t>Step 4: Add the transitions (guards)</w:t>
+        <w:t>Step 5: Add the transitions (guards)</w:t>
       </w:r>
     </w:p>
     <w:p>
@@ -3381,7 +3381,7 @@
         <w:rPr>
           <w:rFonts w:ascii="Calibri" w:hAnsi="Calibri"/>
         </w:rPr>
-        <w:t>Step 5: Confirm the chart data (inputs / outputs)</w:t>
+        <w:t>Step 6: Confirm the chart data (inputs / outputs)</w:t>
       </w:r>
     </w:p>
     <w:p>
@@ -3894,7 +3894,7 @@
         <w:rPr>
           <w:rFonts w:ascii="Calibri" w:hAnsi="Calibri"/>
         </w:rPr>
-        <w:t>Step 6: Update &amp; save</w:t>
+        <w:t>Step 7: Update &amp; save</w:t>
       </w:r>
     </w:p>
     <w:p>
@@ -3939,7 +3939,7 @@
         <w:rPr>
           <w:rFonts w:ascii="Calibri" w:hAnsi="Calibri"/>
         </w:rPr>
-        <w:t>6. Simulate &amp; Validate (Step 7, ~15 min)</w:t>
+        <w:t>6. Simulate &amp; Validate (Step 8, ~15 min)</w:t>
       </w:r>
     </w:p>
     <w:p>
@@ -3976,7 +3976,7 @@
         <w:rPr>
           <w:rFonts w:ascii="Calibri" w:hAnsi="Calibri"/>
         </w:rPr>
-        <w:t>Step 7a: Run the 7 test cases</w:t>
+        <w:t>Step 8a: Run the 7 test cases</w:t>
       </w:r>
     </w:p>
     <w:p>
@@ -5112,7 +5112,7 @@
         <w:t xml:space="preserve">Pass criterion: </w:t>
       </w:r>
       <w:r>
-        <w:t>the State Display block shows the Expected State and `state_id` matches for all 7 cases. If a case fails, re-check the guard conditions (Step 4) — a typo in `&amp;&amp;` / `||` is the usual cause.</w:t>
+        <w:t>the State Display block shows the Expected State and `state_id` matches for all 7 cases. If a case fails, re-check the guard conditions (Step 5) — a typo in `&amp;&amp;` / `||` is the usual cause.</w:t>
       </w:r>
     </w:p>
     <w:p>
@@ -5145,7 +5145,7 @@
         <w:rPr>
           <w:rFonts w:ascii="Calibri" w:hAnsi="Calibri"/>
         </w:rPr>
-        <w:t>7. Generate Code (Step 8, ~10 min)</w:t>
+        <w:t>7. Generate Code (Step 9, ~10 min)</w:t>
       </w:r>
     </w:p>
     <w:p>
@@ -5507,7 +5507,7 @@
         <w:ind w:left="170"/>
       </w:pPr>
       <w:r>
-        <w:t>⚠️ An **Embedded Coder license** is required for `slbuild`. If you only have the Arduino Support Package, the *deploy* step (Step 9) still works because it triggers code generation internally — but the standalone `slbuild` report is the clearest way to *see* the code.</w:t>
+        <w:t>⚠️ An **Embedded Coder license** is required for `slbuild`. If you only have the Arduino Support Package, the *deploy* step (Step 10) still works because it triggers code generation internally — but the standalone `slbuild` report is the clearest way to *see* the code.</w:t>
       </w:r>
     </w:p>
     <w:p>
@@ -5518,7 +5518,7 @@
         <w:rPr>
           <w:rFonts w:ascii="Calibri" w:hAnsi="Calibri"/>
         </w:rPr>
-        <w:t>8. Deploy to Arduino Uno (Step 9, ~15 min)</w:t>
+        <w:t>8. Deploy to Arduino Uno (Step 10, ~15 min)</w:t>
       </w:r>
     </w:p>
     <w:p>
@@ -5529,7 +5529,7 @@
         <w:rPr>
           <w:rFonts w:ascii="Calibri" w:hAnsi="Calibri"/>
         </w:rPr>
-        <w:t>Step 9a: Switch to hardware inputs</w:t>
+        <w:t>Step 10a: Switch to hardware inputs</w:t>
       </w:r>
     </w:p>
     <w:p>
@@ -6100,7 +6100,7 @@
         <w:rPr>
           <w:rFonts w:ascii="Calibri" w:hAnsi="Calibri"/>
         </w:rPr>
-        <w:t>Step 9b: Configure &amp; build for hardware</w:t>
+        <w:t>Step 10b: Configure &amp; build for hardware</w:t>
       </w:r>
     </w:p>
     <w:p>
@@ -6250,7 +6250,7 @@
         <w:rPr>
           <w:rFonts w:ascii="Calibri" w:hAnsi="Calibri"/>
         </w:rPr>
-        <w:t>Step 9c: Read the serial status packet</w:t>
+        <w:t>Step 10c: Read the serial status packet</w:t>
       </w:r>
     </w:p>
     <w:p>
@@ -6392,7 +6392,7 @@
         <w:rPr>
           <w:rFonts w:ascii="Calibri" w:hAnsi="Calibri"/>
         </w:rPr>
-        <w:t>9. Challenge (Step 10, ~10 min)</w:t>
+        <w:t>9. Challenge (Step 11, ~10 min)</w:t>
       </w:r>
     </w:p>
     <w:p>
@@ -7351,7 +7351,7 @@
                 <w:b w:val="0"/>
                 <w:sz w:val="20"/>
               </w:rPr>
-              <w:t>Compare guards to the Step 4 table line by line</w:t>
+              <w:t>Compare guards to the Step 5 table line by line</w:t>
             </w:r>
           </w:p>
         </w:tc>

</xml_diff>

<commit_message>
Fix FAULT guards and MD code block; use ver('embeddedcoder') for Embedded Coder check
</commit_message>
<xml_diff>
--- a/workshop instruction/WS1 - Battery State Controller with Stateflow and Code Generation for Arduino_en.docx
+++ b/workshop instruction/WS1 - Battery State Controller with Stateflow and Code Generation for Arduino_en.docx
@@ -971,7 +971,7 @@
           <w:color w:val="1A1A1A"/>
           <w:sz w:val="18"/>
         </w:rPr>
-        <w:t>&gt;&gt; ver('ecoder')         % Embedded Coder</w:t>
+        <w:t>&gt;&gt; ver('embeddedcoder')         % Embedded Coder</w:t>
       </w:r>
     </w:p>
     <w:p>
@@ -1330,7 +1330,7 @@
                 <w:b w:val="0"/>
                 <w:sz w:val="20"/>
               </w:rPr>
-              <w:t>`ver('ecoder')`</w:t>
+              <w:t>`ver('embeddedcoder')`</w:t>
             </w:r>
           </w:p>
         </w:tc>
@@ -2340,16 +2340,14 @@
         <w:tblLook w:firstColumn="1" w:firstRow="1" w:lastColumn="0" w:lastRow="0" w:noHBand="0" w:noVBand="1" w:val="04A0"/>
       </w:tblPr>
       <w:tblGrid>
-        <w:gridCol w:w="1881"/>
-        <w:gridCol w:w="1881"/>
-        <w:gridCol w:w="1881"/>
-        <w:gridCol w:w="1881"/>
-        <w:gridCol w:w="1881"/>
+        <w:gridCol w:w="3135"/>
+        <w:gridCol w:w="3135"/>
+        <w:gridCol w:w="3135"/>
       </w:tblGrid>
       <w:tr>
         <w:tc>
           <w:tcPr>
-            <w:tcW w:type="dxa" w:w="1881"/>
+            <w:tcW w:type="dxa" w:w="3135"/>
           </w:tcPr>
           <w:p>
             <w:r/>
@@ -2365,7 +2363,7 @@
         </w:tc>
         <w:tc>
           <w:tcPr>
-            <w:tcW w:type="dxa" w:w="1881"/>
+            <w:tcW w:type="dxa" w:w="3135"/>
           </w:tcPr>
           <w:p>
             <w:r/>
@@ -2381,39 +2379,7 @@
         </w:tc>
         <w:tc>
           <w:tcPr>
-            <w:tcW w:type="dxa" w:w="1881"/>
-          </w:tcPr>
-          <w:p>
-            <w:r/>
-            <w:r>
-              <w:rPr>
-                <w:rFonts w:ascii="Calibri" w:hAnsi="Calibri"/>
-                <w:b/>
-                <w:color w:val="003366"/>
-                <w:sz w:val="20"/>
-              </w:rPr>
-            </w:r>
-          </w:p>
-        </w:tc>
-        <w:tc>
-          <w:tcPr>
-            <w:tcW w:type="dxa" w:w="1881"/>
-          </w:tcPr>
-          <w:p>
-            <w:r/>
-            <w:r>
-              <w:rPr>
-                <w:rFonts w:ascii="Calibri" w:hAnsi="Calibri"/>
-                <w:b/>
-                <w:color w:val="003366"/>
-                <w:sz w:val="20"/>
-              </w:rPr>
-            </w:r>
-          </w:p>
-        </w:tc>
-        <w:tc>
-          <w:tcPr>
-            <w:tcW w:type="dxa" w:w="1881"/>
+            <w:tcW w:type="dxa" w:w="3135"/>
           </w:tcPr>
           <w:p>
             <w:r/>
@@ -2431,7 +2397,7 @@
       <w:tr>
         <w:tc>
           <w:tcPr>
-            <w:tcW w:type="dxa" w:w="1881"/>
+            <w:tcW w:type="dxa" w:w="3135"/>
           </w:tcPr>
           <w:p>
             <w:r/>
@@ -2447,7 +2413,7 @@
         </w:tc>
         <w:tc>
           <w:tcPr>
-            <w:tcW w:type="dxa" w:w="1881"/>
+            <w:tcW w:type="dxa" w:w="3135"/>
           </w:tcPr>
           <w:p>
             <w:r/>
@@ -2463,7 +2429,7 @@
         </w:tc>
         <w:tc>
           <w:tcPr>
-            <w:tcW w:type="dxa" w:w="1881"/>
+            <w:tcW w:type="dxa" w:w="3135"/>
           </w:tcPr>
           <w:p>
             <w:r/>
@@ -2477,41 +2443,11 @@
             </w:r>
           </w:p>
         </w:tc>
-        <w:tc>
-          <w:tcPr>
-            <w:tcW w:type="dxa" w:w="1881"/>
-          </w:tcPr>
-          <w:p>
-            <w:r/>
-            <w:r>
-              <w:rPr>
-                <w:rFonts w:ascii="Calibri" w:hAnsi="Calibri"/>
-                <w:b w:val="0"/>
-                <w:sz w:val="20"/>
-              </w:rPr>
-            </w:r>
-          </w:p>
-        </w:tc>
-        <w:tc>
-          <w:tcPr>
-            <w:tcW w:type="dxa" w:w="1881"/>
-          </w:tcPr>
-          <w:p>
-            <w:r/>
-            <w:r>
-              <w:rPr>
-                <w:rFonts w:ascii="Calibri" w:hAnsi="Calibri"/>
-                <w:b w:val="0"/>
-                <w:sz w:val="20"/>
-              </w:rPr>
-            </w:r>
-          </w:p>
-        </w:tc>
       </w:tr>
       <w:tr>
         <w:tc>
           <w:tcPr>
-            <w:tcW w:type="dxa" w:w="1881"/>
+            <w:tcW w:type="dxa" w:w="3135"/>
           </w:tcPr>
           <w:p>
             <w:r/>
@@ -2527,7 +2463,7 @@
         </w:tc>
         <w:tc>
           <w:tcPr>
-            <w:tcW w:type="dxa" w:w="1881"/>
+            <w:tcW w:type="dxa" w:w="3135"/>
           </w:tcPr>
           <w:p>
             <w:r/>
@@ -2543,7 +2479,7 @@
         </w:tc>
         <w:tc>
           <w:tcPr>
-            <w:tcW w:type="dxa" w:w="1881"/>
+            <w:tcW w:type="dxa" w:w="3135"/>
           </w:tcPr>
           <w:p>
             <w:r/>
@@ -2557,41 +2493,11 @@
             </w:r>
           </w:p>
         </w:tc>
-        <w:tc>
-          <w:tcPr>
-            <w:tcW w:type="dxa" w:w="1881"/>
-          </w:tcPr>
-          <w:p>
-            <w:r/>
-            <w:r>
-              <w:rPr>
-                <w:rFonts w:ascii="Calibri" w:hAnsi="Calibri"/>
-                <w:b w:val="0"/>
-                <w:sz w:val="20"/>
-              </w:rPr>
-            </w:r>
-          </w:p>
-        </w:tc>
-        <w:tc>
-          <w:tcPr>
-            <w:tcW w:type="dxa" w:w="1881"/>
-          </w:tcPr>
-          <w:p>
-            <w:r/>
-            <w:r>
-              <w:rPr>
-                <w:rFonts w:ascii="Calibri" w:hAnsi="Calibri"/>
-                <w:b w:val="0"/>
-                <w:sz w:val="20"/>
-              </w:rPr>
-            </w:r>
-          </w:p>
-        </w:tc>
       </w:tr>
       <w:tr>
         <w:tc>
           <w:tcPr>
-            <w:tcW w:type="dxa" w:w="1881"/>
+            <w:tcW w:type="dxa" w:w="3135"/>
           </w:tcPr>
           <w:p>
             <w:r/>
@@ -2607,7 +2513,7 @@
         </w:tc>
         <w:tc>
           <w:tcPr>
-            <w:tcW w:type="dxa" w:w="1881"/>
+            <w:tcW w:type="dxa" w:w="3135"/>
           </w:tcPr>
           <w:p>
             <w:r/>
@@ -2623,7 +2529,7 @@
         </w:tc>
         <w:tc>
           <w:tcPr>
-            <w:tcW w:type="dxa" w:w="1881"/>
+            <w:tcW w:type="dxa" w:w="3135"/>
           </w:tcPr>
           <w:p>
             <w:r/>
@@ -2637,41 +2543,11 @@
             </w:r>
           </w:p>
         </w:tc>
-        <w:tc>
-          <w:tcPr>
-            <w:tcW w:type="dxa" w:w="1881"/>
-          </w:tcPr>
-          <w:p>
-            <w:r/>
-            <w:r>
-              <w:rPr>
-                <w:rFonts w:ascii="Calibri" w:hAnsi="Calibri"/>
-                <w:b w:val="0"/>
-                <w:sz w:val="20"/>
-              </w:rPr>
-            </w:r>
-          </w:p>
-        </w:tc>
-        <w:tc>
-          <w:tcPr>
-            <w:tcW w:type="dxa" w:w="1881"/>
-          </w:tcPr>
-          <w:p>
-            <w:r/>
-            <w:r>
-              <w:rPr>
-                <w:rFonts w:ascii="Calibri" w:hAnsi="Calibri"/>
-                <w:b w:val="0"/>
-                <w:sz w:val="20"/>
-              </w:rPr>
-            </w:r>
-          </w:p>
-        </w:tc>
       </w:tr>
       <w:tr>
         <w:tc>
           <w:tcPr>
-            <w:tcW w:type="dxa" w:w="1881"/>
+            <w:tcW w:type="dxa" w:w="3135"/>
           </w:tcPr>
           <w:p>
             <w:r/>
@@ -2687,7 +2563,7 @@
         </w:tc>
         <w:tc>
           <w:tcPr>
-            <w:tcW w:type="dxa" w:w="1881"/>
+            <w:tcW w:type="dxa" w:w="3135"/>
           </w:tcPr>
           <w:p>
             <w:r/>
@@ -2697,45 +2573,13 @@
                 <w:b w:val="0"/>
                 <w:sz w:val="20"/>
               </w:rPr>
-              <w:t>`[Vpack &lt; 9.0</w:t>
+              <w:t>*(see the block below)*</w:t>
             </w:r>
           </w:p>
         </w:tc>
         <w:tc>
           <w:tcPr>
-            <w:tcW w:type="dxa" w:w="1881"/>
-          </w:tcPr>
-          <w:p>
-            <w:r/>
-            <w:r>
-              <w:rPr>
-                <w:rFonts w:ascii="Calibri" w:hAnsi="Calibri"/>
-                <w:b w:val="0"/>
-                <w:sz w:val="20"/>
-              </w:rPr>
-              <w:t>Vpack &gt; 12.6</w:t>
-            </w:r>
-          </w:p>
-        </w:tc>
-        <w:tc>
-          <w:tcPr>
-            <w:tcW w:type="dxa" w:w="1881"/>
-          </w:tcPr>
-          <w:p>
-            <w:r/>
-            <w:r>
-              <w:rPr>
-                <w:rFonts w:ascii="Calibri" w:hAnsi="Calibri"/>
-                <w:b w:val="0"/>
-                <w:sz w:val="20"/>
-              </w:rPr>
-              <w:t>BatteryTemp_C &gt; 50]`</w:t>
-            </w:r>
-          </w:p>
-        </w:tc>
-        <w:tc>
-          <w:tcPr>
-            <w:tcW w:type="dxa" w:w="1881"/>
+            <w:tcW w:type="dxa" w:w="3135"/>
           </w:tcPr>
           <w:p>
             <w:r/>
@@ -2753,7 +2597,7 @@
       <w:tr>
         <w:tc>
           <w:tcPr>
-            <w:tcW w:type="dxa" w:w="1881"/>
+            <w:tcW w:type="dxa" w:w="3135"/>
           </w:tcPr>
           <w:p>
             <w:r/>
@@ -2769,7 +2613,7 @@
         </w:tc>
         <w:tc>
           <w:tcPr>
-            <w:tcW w:type="dxa" w:w="1881"/>
+            <w:tcW w:type="dxa" w:w="3135"/>
           </w:tcPr>
           <w:p>
             <w:r/>
@@ -2785,7 +2629,7 @@
         </w:tc>
         <w:tc>
           <w:tcPr>
-            <w:tcW w:type="dxa" w:w="1881"/>
+            <w:tcW w:type="dxa" w:w="3135"/>
           </w:tcPr>
           <w:p>
             <w:r/>
@@ -2799,41 +2643,11 @@
             </w:r>
           </w:p>
         </w:tc>
-        <w:tc>
-          <w:tcPr>
-            <w:tcW w:type="dxa" w:w="1881"/>
-          </w:tcPr>
-          <w:p>
-            <w:r/>
-            <w:r>
-              <w:rPr>
-                <w:rFonts w:ascii="Calibri" w:hAnsi="Calibri"/>
-                <w:b w:val="0"/>
-                <w:sz w:val="20"/>
-              </w:rPr>
-            </w:r>
-          </w:p>
-        </w:tc>
-        <w:tc>
-          <w:tcPr>
-            <w:tcW w:type="dxa" w:w="1881"/>
-          </w:tcPr>
-          <w:p>
-            <w:r/>
-            <w:r>
-              <w:rPr>
-                <w:rFonts w:ascii="Calibri" w:hAnsi="Calibri"/>
-                <w:b w:val="0"/>
-                <w:sz w:val="20"/>
-              </w:rPr>
-            </w:r>
-          </w:p>
-        </w:tc>
       </w:tr>
       <w:tr>
         <w:tc>
           <w:tcPr>
-            <w:tcW w:type="dxa" w:w="1881"/>
+            <w:tcW w:type="dxa" w:w="3135"/>
           </w:tcPr>
           <w:p>
             <w:r/>
@@ -2849,7 +2663,7 @@
         </w:tc>
         <w:tc>
           <w:tcPr>
-            <w:tcW w:type="dxa" w:w="1881"/>
+            <w:tcW w:type="dxa" w:w="3135"/>
           </w:tcPr>
           <w:p>
             <w:r/>
@@ -2865,7 +2679,7 @@
         </w:tc>
         <w:tc>
           <w:tcPr>
-            <w:tcW w:type="dxa" w:w="1881"/>
+            <w:tcW w:type="dxa" w:w="3135"/>
           </w:tcPr>
           <w:p>
             <w:r/>
@@ -2879,41 +2693,11 @@
             </w:r>
           </w:p>
         </w:tc>
-        <w:tc>
-          <w:tcPr>
-            <w:tcW w:type="dxa" w:w="1881"/>
-          </w:tcPr>
-          <w:p>
-            <w:r/>
-            <w:r>
-              <w:rPr>
-                <w:rFonts w:ascii="Calibri" w:hAnsi="Calibri"/>
-                <w:b w:val="0"/>
-                <w:sz w:val="20"/>
-              </w:rPr>
-            </w:r>
-          </w:p>
-        </w:tc>
-        <w:tc>
-          <w:tcPr>
-            <w:tcW w:type="dxa" w:w="1881"/>
-          </w:tcPr>
-          <w:p>
-            <w:r/>
-            <w:r>
-              <w:rPr>
-                <w:rFonts w:ascii="Calibri" w:hAnsi="Calibri"/>
-                <w:b w:val="0"/>
-                <w:sz w:val="20"/>
-              </w:rPr>
-            </w:r>
-          </w:p>
-        </w:tc>
       </w:tr>
       <w:tr>
         <w:tc>
           <w:tcPr>
-            <w:tcW w:type="dxa" w:w="1881"/>
+            <w:tcW w:type="dxa" w:w="3135"/>
           </w:tcPr>
           <w:p>
             <w:r/>
@@ -2929,7 +2713,7 @@
         </w:tc>
         <w:tc>
           <w:tcPr>
-            <w:tcW w:type="dxa" w:w="1881"/>
+            <w:tcW w:type="dxa" w:w="3135"/>
           </w:tcPr>
           <w:p>
             <w:r/>
@@ -2939,45 +2723,13 @@
                 <w:b w:val="0"/>
                 <w:sz w:val="20"/>
               </w:rPr>
-              <w:t>`[Vpack &lt; 9.0</w:t>
+              <w:t>*(see the block below)*</w:t>
             </w:r>
           </w:p>
         </w:tc>
         <w:tc>
           <w:tcPr>
-            <w:tcW w:type="dxa" w:w="1881"/>
-          </w:tcPr>
-          <w:p>
-            <w:r/>
-            <w:r>
-              <w:rPr>
-                <w:rFonts w:ascii="Calibri" w:hAnsi="Calibri"/>
-                <w:b w:val="0"/>
-                <w:sz w:val="20"/>
-              </w:rPr>
-              <w:t>Vpack &gt; 12.6</w:t>
-            </w:r>
-          </w:p>
-        </w:tc>
-        <w:tc>
-          <w:tcPr>
-            <w:tcW w:type="dxa" w:w="1881"/>
-          </w:tcPr>
-          <w:p>
-            <w:r/>
-            <w:r>
-              <w:rPr>
-                <w:rFonts w:ascii="Calibri" w:hAnsi="Calibri"/>
-                <w:b w:val="0"/>
-                <w:sz w:val="20"/>
-              </w:rPr>
-              <w:t>BatteryTemp_C &gt; 50]`</w:t>
-            </w:r>
-          </w:p>
-        </w:tc>
-        <w:tc>
-          <w:tcPr>
-            <w:tcW w:type="dxa" w:w="1881"/>
+            <w:tcW w:type="dxa" w:w="3135"/>
           </w:tcPr>
           <w:p>
             <w:r/>
@@ -2995,7 +2747,7 @@
       <w:tr>
         <w:tc>
           <w:tcPr>
-            <w:tcW w:type="dxa" w:w="1881"/>
+            <w:tcW w:type="dxa" w:w="3135"/>
           </w:tcPr>
           <w:p>
             <w:r/>
@@ -3011,7 +2763,7 @@
         </w:tc>
         <w:tc>
           <w:tcPr>
-            <w:tcW w:type="dxa" w:w="1881"/>
+            <w:tcW w:type="dxa" w:w="3135"/>
           </w:tcPr>
           <w:p>
             <w:r/>
@@ -3027,7 +2779,7 @@
         </w:tc>
         <w:tc>
           <w:tcPr>
-            <w:tcW w:type="dxa" w:w="1881"/>
+            <w:tcW w:type="dxa" w:w="3135"/>
           </w:tcPr>
           <w:p>
             <w:r/>
@@ -3041,41 +2793,11 @@
             </w:r>
           </w:p>
         </w:tc>
-        <w:tc>
-          <w:tcPr>
-            <w:tcW w:type="dxa" w:w="1881"/>
-          </w:tcPr>
-          <w:p>
-            <w:r/>
-            <w:r>
-              <w:rPr>
-                <w:rFonts w:ascii="Calibri" w:hAnsi="Calibri"/>
-                <w:b w:val="0"/>
-                <w:sz w:val="20"/>
-              </w:rPr>
-            </w:r>
-          </w:p>
-        </w:tc>
-        <w:tc>
-          <w:tcPr>
-            <w:tcW w:type="dxa" w:w="1881"/>
-          </w:tcPr>
-          <w:p>
-            <w:r/>
-            <w:r>
-              <w:rPr>
-                <w:rFonts w:ascii="Calibri" w:hAnsi="Calibri"/>
-                <w:b w:val="0"/>
-                <w:sz w:val="20"/>
-              </w:rPr>
-            </w:r>
-          </w:p>
-        </w:tc>
       </w:tr>
       <w:tr>
         <w:tc>
           <w:tcPr>
-            <w:tcW w:type="dxa" w:w="1881"/>
+            <w:tcW w:type="dxa" w:w="3135"/>
           </w:tcPr>
           <w:p>
             <w:r/>
@@ -3091,7 +2813,7 @@
         </w:tc>
         <w:tc>
           <w:tcPr>
-            <w:tcW w:type="dxa" w:w="1881"/>
+            <w:tcW w:type="dxa" w:w="3135"/>
           </w:tcPr>
           <w:p>
             <w:r/>
@@ -3107,7 +2829,7 @@
         </w:tc>
         <w:tc>
           <w:tcPr>
-            <w:tcW w:type="dxa" w:w="1881"/>
+            <w:tcW w:type="dxa" w:w="3135"/>
           </w:tcPr>
           <w:p>
             <w:r/>
@@ -3121,41 +2843,11 @@
             </w:r>
           </w:p>
         </w:tc>
-        <w:tc>
-          <w:tcPr>
-            <w:tcW w:type="dxa" w:w="1881"/>
-          </w:tcPr>
-          <w:p>
-            <w:r/>
-            <w:r>
-              <w:rPr>
-                <w:rFonts w:ascii="Calibri" w:hAnsi="Calibri"/>
-                <w:b w:val="0"/>
-                <w:sz w:val="20"/>
-              </w:rPr>
-            </w:r>
-          </w:p>
-        </w:tc>
-        <w:tc>
-          <w:tcPr>
-            <w:tcW w:type="dxa" w:w="1881"/>
-          </w:tcPr>
-          <w:p>
-            <w:r/>
-            <w:r>
-              <w:rPr>
-                <w:rFonts w:ascii="Calibri" w:hAnsi="Calibri"/>
-                <w:b w:val="0"/>
-                <w:sz w:val="20"/>
-              </w:rPr>
-            </w:r>
-          </w:p>
-        </w:tc>
       </w:tr>
       <w:tr>
         <w:tc>
           <w:tcPr>
-            <w:tcW w:type="dxa" w:w="1881"/>
+            <w:tcW w:type="dxa" w:w="3135"/>
           </w:tcPr>
           <w:p>
             <w:r/>
@@ -3171,7 +2863,7 @@
         </w:tc>
         <w:tc>
           <w:tcPr>
-            <w:tcW w:type="dxa" w:w="1881"/>
+            <w:tcW w:type="dxa" w:w="3135"/>
           </w:tcPr>
           <w:p>
             <w:r/>
@@ -3181,45 +2873,13 @@
                 <w:b w:val="0"/>
                 <w:sz w:val="20"/>
               </w:rPr>
-              <w:t>`[Vpack &lt; 9.0</w:t>
+              <w:t>*(see the block below)*</w:t>
             </w:r>
           </w:p>
         </w:tc>
         <w:tc>
           <w:tcPr>
-            <w:tcW w:type="dxa" w:w="1881"/>
-          </w:tcPr>
-          <w:p>
-            <w:r/>
-            <w:r>
-              <w:rPr>
-                <w:rFonts w:ascii="Calibri" w:hAnsi="Calibri"/>
-                <w:b w:val="0"/>
-                <w:sz w:val="20"/>
-              </w:rPr>
-              <w:t>Vpack &gt; 12.6</w:t>
-            </w:r>
-          </w:p>
-        </w:tc>
-        <w:tc>
-          <w:tcPr>
-            <w:tcW w:type="dxa" w:w="1881"/>
-          </w:tcPr>
-          <w:p>
-            <w:r/>
-            <w:r>
-              <w:rPr>
-                <w:rFonts w:ascii="Calibri" w:hAnsi="Calibri"/>
-                <w:b w:val="0"/>
-                <w:sz w:val="20"/>
-              </w:rPr>
-              <w:t>BatteryTemp_C &gt; 50]`</w:t>
-            </w:r>
-          </w:p>
-        </w:tc>
-        <w:tc>
-          <w:tcPr>
-            <w:tcW w:type="dxa" w:w="1881"/>
+            <w:tcW w:type="dxa" w:w="3135"/>
           </w:tcPr>
           <w:p>
             <w:r/>
@@ -3237,7 +2897,7 @@
       <w:tr>
         <w:tc>
           <w:tcPr>
-            <w:tcW w:type="dxa" w:w="1881"/>
+            <w:tcW w:type="dxa" w:w="3135"/>
           </w:tcPr>
           <w:p>
             <w:r/>
@@ -3253,7 +2913,7 @@
         </w:tc>
         <w:tc>
           <w:tcPr>
-            <w:tcW w:type="dxa" w:w="1881"/>
+            <w:tcW w:type="dxa" w:w="3135"/>
           </w:tcPr>
           <w:p>
             <w:r/>
@@ -3269,7 +2929,7 @@
         </w:tc>
         <w:tc>
           <w:tcPr>
-            <w:tcW w:type="dxa" w:w="1881"/>
+            <w:tcW w:type="dxa" w:w="3135"/>
           </w:tcPr>
           <w:p>
             <w:r/>
@@ -3283,38 +2943,57 @@
             </w:r>
           </w:p>
         </w:tc>
-        <w:tc>
-          <w:tcPr>
-            <w:tcW w:type="dxa" w:w="1881"/>
-          </w:tcPr>
-          <w:p>
-            <w:r/>
-            <w:r>
-              <w:rPr>
-                <w:rFonts w:ascii="Calibri" w:hAnsi="Calibri"/>
-                <w:b w:val="0"/>
-                <w:sz w:val="20"/>
-              </w:rPr>
-            </w:r>
-          </w:p>
-        </w:tc>
-        <w:tc>
-          <w:tcPr>
-            <w:tcW w:type="dxa" w:w="1881"/>
-          </w:tcPr>
-          <w:p>
-            <w:r/>
-            <w:r>
-              <w:rPr>
-                <w:rFonts w:ascii="Calibri" w:hAnsi="Calibri"/>
-                <w:b w:val="0"/>
-                <w:sz w:val="20"/>
-              </w:rPr>
-            </w:r>
-          </w:p>
-        </w:tc>
       </w:tr>
     </w:tbl>
+    <w:p>
+      <w:pPr>
+        <w:spacing w:after="40"/>
+      </w:pPr>
+    </w:p>
+    <w:p>
+      <w:pPr>
+        <w:spacing w:after="0"/>
+        <w:ind w:left="283"/>
+      </w:pPr>
+      <w:r>
+        <w:rPr>
+          <w:rFonts w:ascii="Consolas" w:hAnsi="Consolas"/>
+          <w:color w:val="1A1A1A"/>
+          <w:sz w:val="18"/>
+        </w:rPr>
+        <w:t>IDLE → FAULT          [Vpack &lt; 9.0 || Vpack &gt; 12.6 || BatteryTemp_C &gt; 50]</w:t>
+        <w:br/>
+      </w:r>
+    </w:p>
+    <w:p>
+      <w:pPr>
+        <w:spacing w:after="0"/>
+        <w:ind w:left="283"/>
+      </w:pPr>
+      <w:r>
+        <w:rPr>
+          <w:rFonts w:ascii="Consolas" w:hAnsi="Consolas"/>
+          <w:color w:val="1A1A1A"/>
+          <w:sz w:val="18"/>
+        </w:rPr>
+        <w:t>CHARGING → FAULT      [Vpack &lt; 9.0 || Vpack &gt; 12.6 || BatteryTemp_C &gt; 50]</w:t>
+        <w:br/>
+      </w:r>
+    </w:p>
+    <w:p>
+      <w:pPr>
+        <w:spacing w:after="0"/>
+        <w:ind w:left="283"/>
+      </w:pPr>
+      <w:r>
+        <w:rPr>
+          <w:rFonts w:ascii="Consolas" w:hAnsi="Consolas"/>
+          <w:color w:val="1A1A1A"/>
+          <w:sz w:val="18"/>
+        </w:rPr>
+        <w:t>DISCHARGING → FAULT   [Vpack &lt; 9.0 || Vpack &gt; 12.6 || BatteryTemp_C &gt; 50]</w:t>
+      </w:r>
+    </w:p>
     <w:p>
       <w:pPr>
         <w:spacing w:after="40"/>
@@ -7024,15 +6703,14 @@
         <w:tblLook w:firstColumn="1" w:firstRow="1" w:lastColumn="0" w:lastRow="0" w:noHBand="0" w:noVBand="1" w:val="04A0"/>
       </w:tblPr>
       <w:tblGrid>
-        <w:gridCol w:w="2351"/>
-        <w:gridCol w:w="2351"/>
-        <w:gridCol w:w="2351"/>
-        <w:gridCol w:w="2351"/>
+        <w:gridCol w:w="3135"/>
+        <w:gridCol w:w="3135"/>
+        <w:gridCol w:w="3135"/>
       </w:tblGrid>
       <w:tr>
         <w:tc>
           <w:tcPr>
-            <w:tcW w:type="dxa" w:w="2351"/>
+            <w:tcW w:type="dxa" w:w="3135"/>
           </w:tcPr>
           <w:p>
             <w:r/>
@@ -7048,7 +6726,7 @@
         </w:tc>
         <w:tc>
           <w:tcPr>
-            <w:tcW w:type="dxa" w:w="2351"/>
+            <w:tcW w:type="dxa" w:w="3135"/>
           </w:tcPr>
           <w:p>
             <w:r/>
@@ -7064,23 +6742,7 @@
         </w:tc>
         <w:tc>
           <w:tcPr>
-            <w:tcW w:type="dxa" w:w="2351"/>
-          </w:tcPr>
-          <w:p>
-            <w:r/>
-            <w:r>
-              <w:rPr>
-                <w:rFonts w:ascii="Calibri" w:hAnsi="Calibri"/>
-                <w:b/>
-                <w:color w:val="003366"/>
-                <w:sz w:val="20"/>
-              </w:rPr>
-            </w:r>
-          </w:p>
-        </w:tc>
-        <w:tc>
-          <w:tcPr>
-            <w:tcW w:type="dxa" w:w="2351"/>
+            <w:tcW w:type="dxa" w:w="3135"/>
           </w:tcPr>
           <w:p>
             <w:r/>
@@ -7098,7 +6760,7 @@
       <w:tr>
         <w:tc>
           <w:tcPr>
-            <w:tcW w:type="dxa" w:w="2351"/>
+            <w:tcW w:type="dxa" w:w="3135"/>
           </w:tcPr>
           <w:p>
             <w:r/>
@@ -7114,7 +6776,7 @@
         </w:tc>
         <w:tc>
           <w:tcPr>
-            <w:tcW w:type="dxa" w:w="2351"/>
+            <w:tcW w:type="dxa" w:w="3135"/>
           </w:tcPr>
           <w:p>
             <w:r/>
@@ -7130,7 +6792,7 @@
         </w:tc>
         <w:tc>
           <w:tcPr>
-            <w:tcW w:type="dxa" w:w="2351"/>
+            <w:tcW w:type="dxa" w:w="3135"/>
           </w:tcPr>
           <w:p>
             <w:r/>
@@ -7144,26 +6806,11 @@
             </w:r>
           </w:p>
         </w:tc>
-        <w:tc>
-          <w:tcPr>
-            <w:tcW w:type="dxa" w:w="2351"/>
-          </w:tcPr>
-          <w:p>
-            <w:r/>
-            <w:r>
-              <w:rPr>
-                <w:rFonts w:ascii="Calibri" w:hAnsi="Calibri"/>
-                <w:b w:val="0"/>
-                <w:sz w:val="20"/>
-              </w:rPr>
-            </w:r>
-          </w:p>
-        </w:tc>
       </w:tr>
       <w:tr>
         <w:tc>
           <w:tcPr>
-            <w:tcW w:type="dxa" w:w="2351"/>
+            <w:tcW w:type="dxa" w:w="3135"/>
           </w:tcPr>
           <w:p>
             <w:r/>
@@ -7179,7 +6826,7 @@
         </w:tc>
         <w:tc>
           <w:tcPr>
-            <w:tcW w:type="dxa" w:w="2351"/>
+            <w:tcW w:type="dxa" w:w="3135"/>
           </w:tcPr>
           <w:p>
             <w:r/>
@@ -7195,7 +6842,7 @@
         </w:tc>
         <w:tc>
           <w:tcPr>
-            <w:tcW w:type="dxa" w:w="2351"/>
+            <w:tcW w:type="dxa" w:w="3135"/>
           </w:tcPr>
           <w:p>
             <w:r/>
@@ -7209,26 +6856,11 @@
             </w:r>
           </w:p>
         </w:tc>
-        <w:tc>
-          <w:tcPr>
-            <w:tcW w:type="dxa" w:w="2351"/>
-          </w:tcPr>
-          <w:p>
-            <w:r/>
-            <w:r>
-              <w:rPr>
-                <w:rFonts w:ascii="Calibri" w:hAnsi="Calibri"/>
-                <w:b w:val="0"/>
-                <w:sz w:val="20"/>
-              </w:rPr>
-            </w:r>
-          </w:p>
-        </w:tc>
       </w:tr>
       <w:tr>
         <w:tc>
           <w:tcPr>
-            <w:tcW w:type="dxa" w:w="2351"/>
+            <w:tcW w:type="dxa" w:w="3135"/>
           </w:tcPr>
           <w:p>
             <w:r/>
@@ -7244,7 +6876,7 @@
         </w:tc>
         <w:tc>
           <w:tcPr>
-            <w:tcW w:type="dxa" w:w="2351"/>
+            <w:tcW w:type="dxa" w:w="3135"/>
           </w:tcPr>
           <w:p>
             <w:r/>
@@ -7260,7 +6892,7 @@
         </w:tc>
         <w:tc>
           <w:tcPr>
-            <w:tcW w:type="dxa" w:w="2351"/>
+            <w:tcW w:type="dxa" w:w="3135"/>
           </w:tcPr>
           <w:p>
             <w:r/>
@@ -7274,26 +6906,11 @@
             </w:r>
           </w:p>
         </w:tc>
-        <w:tc>
-          <w:tcPr>
-            <w:tcW w:type="dxa" w:w="2351"/>
-          </w:tcPr>
-          <w:p>
-            <w:r/>
-            <w:r>
-              <w:rPr>
-                <w:rFonts w:ascii="Calibri" w:hAnsi="Calibri"/>
-                <w:b w:val="0"/>
-                <w:sz w:val="20"/>
-              </w:rPr>
-            </w:r>
-          </w:p>
-        </w:tc>
       </w:tr>
       <w:tr>
         <w:tc>
           <w:tcPr>
-            <w:tcW w:type="dxa" w:w="2351"/>
+            <w:tcW w:type="dxa" w:w="3135"/>
           </w:tcPr>
           <w:p>
             <w:r/>
@@ -7309,7 +6926,7 @@
         </w:tc>
         <w:tc>
           <w:tcPr>
-            <w:tcW w:type="dxa" w:w="2351"/>
+            <w:tcW w:type="dxa" w:w="3135"/>
           </w:tcPr>
           <w:p>
             <w:r/>
@@ -7319,29 +6936,13 @@
                 <w:b w:val="0"/>
                 <w:sz w:val="20"/>
               </w:rPr>
-              <w:t>Typo in `&amp;&amp;` / `</w:t>
+              <w:t>Typo in an AND or OR guard</w:t>
             </w:r>
           </w:p>
         </w:tc>
         <w:tc>
           <w:tcPr>
-            <w:tcW w:type="dxa" w:w="2351"/>
-          </w:tcPr>
-          <w:p>
-            <w:r/>
-            <w:r>
-              <w:rPr>
-                <w:rFonts w:ascii="Calibri" w:hAnsi="Calibri"/>
-                <w:b w:val="0"/>
-                <w:sz w:val="20"/>
-              </w:rPr>
-              <w:t>` guard</w:t>
-            </w:r>
-          </w:p>
-        </w:tc>
-        <w:tc>
-          <w:tcPr>
-            <w:tcW w:type="dxa" w:w="2351"/>
+            <w:tcW w:type="dxa" w:w="3135"/>
           </w:tcPr>
           <w:p>
             <w:r/>
@@ -7359,7 +6960,7 @@
       <w:tr>
         <w:tc>
           <w:tcPr>
-            <w:tcW w:type="dxa" w:w="2351"/>
+            <w:tcW w:type="dxa" w:w="3135"/>
           </w:tcPr>
           <w:p>
             <w:r/>
@@ -7375,7 +6976,7 @@
         </w:tc>
         <w:tc>
           <w:tcPr>
-            <w:tcW w:type="dxa" w:w="2351"/>
+            <w:tcW w:type="dxa" w:w="3135"/>
           </w:tcPr>
           <w:p>
             <w:r/>
@@ -7391,7 +6992,7 @@
         </w:tc>
         <w:tc>
           <w:tcPr>
-            <w:tcW w:type="dxa" w:w="2351"/>
+            <w:tcW w:type="dxa" w:w="3135"/>
           </w:tcPr>
           <w:p>
             <w:r/>
@@ -7405,26 +7006,11 @@
             </w:r>
           </w:p>
         </w:tc>
-        <w:tc>
-          <w:tcPr>
-            <w:tcW w:type="dxa" w:w="2351"/>
-          </w:tcPr>
-          <w:p>
-            <w:r/>
-            <w:r>
-              <w:rPr>
-                <w:rFonts w:ascii="Calibri" w:hAnsi="Calibri"/>
-                <w:b w:val="0"/>
-                <w:sz w:val="20"/>
-              </w:rPr>
-            </w:r>
-          </w:p>
-        </w:tc>
       </w:tr>
       <w:tr>
         <w:tc>
           <w:tcPr>
-            <w:tcW w:type="dxa" w:w="2351"/>
+            <w:tcW w:type="dxa" w:w="3135"/>
           </w:tcPr>
           <w:p>
             <w:r/>
@@ -7440,7 +7026,7 @@
         </w:tc>
         <w:tc>
           <w:tcPr>
-            <w:tcW w:type="dxa" w:w="2351"/>
+            <w:tcW w:type="dxa" w:w="3135"/>
           </w:tcPr>
           <w:p>
             <w:r/>
@@ -7456,7 +7042,7 @@
         </w:tc>
         <w:tc>
           <w:tcPr>
-            <w:tcW w:type="dxa" w:w="2351"/>
+            <w:tcW w:type="dxa" w:w="3135"/>
           </w:tcPr>
           <w:p>
             <w:r/>
@@ -7470,26 +7056,11 @@
             </w:r>
           </w:p>
         </w:tc>
-        <w:tc>
-          <w:tcPr>
-            <w:tcW w:type="dxa" w:w="2351"/>
-          </w:tcPr>
-          <w:p>
-            <w:r/>
-            <w:r>
-              <w:rPr>
-                <w:rFonts w:ascii="Calibri" w:hAnsi="Calibri"/>
-                <w:b w:val="0"/>
-                <w:sz w:val="20"/>
-              </w:rPr>
-            </w:r>
-          </w:p>
-        </w:tc>
       </w:tr>
       <w:tr>
         <w:tc>
           <w:tcPr>
-            <w:tcW w:type="dxa" w:w="2351"/>
+            <w:tcW w:type="dxa" w:w="3135"/>
           </w:tcPr>
           <w:p>
             <w:r/>
@@ -7505,7 +7076,7 @@
         </w:tc>
         <w:tc>
           <w:tcPr>
-            <w:tcW w:type="dxa" w:w="2351"/>
+            <w:tcW w:type="dxa" w:w="3135"/>
           </w:tcPr>
           <w:p>
             <w:r/>
@@ -7521,7 +7092,7 @@
         </w:tc>
         <w:tc>
           <w:tcPr>
-            <w:tcW w:type="dxa" w:w="2351"/>
+            <w:tcW w:type="dxa" w:w="3135"/>
           </w:tcPr>
           <w:p>
             <w:r/>
@@ -7535,26 +7106,11 @@
             </w:r>
           </w:p>
         </w:tc>
-        <w:tc>
-          <w:tcPr>
-            <w:tcW w:type="dxa" w:w="2351"/>
-          </w:tcPr>
-          <w:p>
-            <w:r/>
-            <w:r>
-              <w:rPr>
-                <w:rFonts w:ascii="Calibri" w:hAnsi="Calibri"/>
-                <w:b w:val="0"/>
-                <w:sz w:val="20"/>
-              </w:rPr>
-            </w:r>
-          </w:p>
-        </w:tc>
       </w:tr>
       <w:tr>
         <w:tc>
           <w:tcPr>
-            <w:tcW w:type="dxa" w:w="2351"/>
+            <w:tcW w:type="dxa" w:w="3135"/>
           </w:tcPr>
           <w:p>
             <w:r/>
@@ -7570,7 +7126,7 @@
         </w:tc>
         <w:tc>
           <w:tcPr>
-            <w:tcW w:type="dxa" w:w="2351"/>
+            <w:tcW w:type="dxa" w:w="3135"/>
           </w:tcPr>
           <w:p>
             <w:r/>
@@ -7586,7 +7142,7 @@
         </w:tc>
         <w:tc>
           <w:tcPr>
-            <w:tcW w:type="dxa" w:w="2351"/>
+            <w:tcW w:type="dxa" w:w="3135"/>
           </w:tcPr>
           <w:p>
             <w:r/>
@@ -7597,21 +7153,6 @@
                 <w:sz w:val="20"/>
               </w:rPr>
               <w:t>Confirm Source Select = down (Arduino A0/A1/A2)</w:t>
-            </w:r>
-          </w:p>
-        </w:tc>
-        <w:tc>
-          <w:tcPr>
-            <w:tcW w:type="dxa" w:w="2351"/>
-          </w:tcPr>
-          <w:p>
-            <w:r/>
-            <w:r>
-              <w:rPr>
-                <w:rFonts w:ascii="Calibri" w:hAnsi="Calibri"/>
-                <w:b w:val="0"/>
-                <w:sz w:val="20"/>
-              </w:rPr>
             </w:r>
           </w:p>
         </w:tc>

</xml_diff>

<commit_message>
Add Arduino support package and ver check screenshots to guides and README
</commit_message>
<xml_diff>
--- a/workshop instruction/WS1 - Battery State Controller with Stateflow and Code Generation for Arduino_en.docx
+++ b/workshop instruction/WS1 - Battery State Controller with Stateflow and Code Generation for Arduino_en.docx
@@ -1081,6 +1081,81 @@
     </w:p>
     <w:p>
       <w:pPr>
+        <w:jc w:val="center"/>
+        <w:keepNext/>
+      </w:pPr>
+      <w:r>
+        <w:drawing>
+          <wp:inline xmlns:a="http://schemas.openxmlformats.org/drawingml/2006/main" xmlns:pic="http://schemas.openxmlformats.org/drawingml/2006/picture">
+            <wp:extent cx="5040000" cy="2807000"/>
+            <wp:docPr id="1" name="Picture 1"/>
+            <wp:cNvGraphicFramePr>
+              <a:graphicFrameLocks noChangeAspect="1"/>
+            </wp:cNvGraphicFramePr>
+            <a:graphic>
+              <a:graphicData uri="http://schemas.openxmlformats.org/drawingml/2006/picture">
+                <pic:pic>
+                  <pic:nvPicPr>
+                    <pic:cNvPr id="0" name="screenshot_support_package_installed.png"/>
+                    <pic:cNvPicPr/>
+                  </pic:nvPicPr>
+                  <pic:blipFill>
+                    <a:blip r:embed="rId10"/>
+                    <a:stretch>
+                      <a:fillRect/>
+                    </a:stretch>
+                  </pic:blipFill>
+                  <pic:spPr>
+                    <a:xfrm>
+                      <a:off x="0" y="0"/>
+                      <a:ext cx="5040000" cy="2807000"/>
+                    </a:xfrm>
+                    <a:prstGeom prst="rect"/>
+                  </pic:spPr>
+                </pic:pic>
+              </a:graphicData>
+            </a:graphic>
+          </wp:inline>
+        </w:drawing>
+      </w:r>
+    </w:p>
+    <w:p>
+      <w:pPr>
+        <w:spacing w:after="120"/>
+      </w:pPr>
+      <w:r>
+        <w:t xml:space="preserve">*Both Arduino packages are highlighted in red: </w:t>
+      </w:r>
+      <w:r>
+        <w:rPr>
+          <w:b/>
+        </w:rPr>
+        <w:t>Simulink Support Package for Arduino Hardware</w:t>
+      </w:r>
+      <w:r>
+        <w:t xml:space="preserve"> (left) and </w:t>
+      </w:r>
+      <w:r>
+        <w:rPr>
+          <w:b/>
+        </w:rPr>
+        <w:t>MATLAB Support Package for Arduino Hardware</w:t>
+      </w:r>
+      <w:r>
+        <w:t xml:space="preserve"> (middle). Both must show </w:t>
+      </w:r>
+      <w:r>
+        <w:rPr>
+          <w:b/>
+        </w:rPr>
+        <w:t>Installed</w:t>
+      </w:r>
+      <w:r>
+        <w:t>.*</w:t>
+      </w:r>
+    </w:p>
+    <w:p>
+      <w:pPr>
         <w:spacing w:after="120"/>
       </w:pPr>
       <w:r>
@@ -1359,6 +1434,126 @@
     </w:p>
     <w:p>
       <w:pPr>
+        <w:jc w:val="center"/>
+        <w:keepNext/>
+      </w:pPr>
+      <w:r>
+        <w:drawing>
+          <wp:inline xmlns:a="http://schemas.openxmlformats.org/drawingml/2006/main" xmlns:pic="http://schemas.openxmlformats.org/drawingml/2006/picture">
+            <wp:extent cx="5040000" cy="2675769"/>
+            <wp:docPr id="2" name="Picture 2"/>
+            <wp:cNvGraphicFramePr>
+              <a:graphicFrameLocks noChangeAspect="1"/>
+            </wp:cNvGraphicFramePr>
+            <a:graphic>
+              <a:graphicData uri="http://schemas.openxmlformats.org/drawingml/2006/picture">
+                <pic:pic>
+                  <pic:nvPicPr>
+                    <pic:cNvPr id="0" name="screenshot_ver_stateflow.png"/>
+                    <pic:cNvPicPr/>
+                  </pic:nvPicPr>
+                  <pic:blipFill>
+                    <a:blip r:embed="rId11"/>
+                    <a:stretch>
+                      <a:fillRect/>
+                    </a:stretch>
+                  </pic:blipFill>
+                  <pic:spPr>
+                    <a:xfrm>
+                      <a:off x="0" y="0"/>
+                      <a:ext cx="5040000" cy="2675769"/>
+                    </a:xfrm>
+                    <a:prstGeom prst="rect"/>
+                  </pic:spPr>
+                </pic:pic>
+              </a:graphicData>
+            </a:graphic>
+          </wp:inline>
+        </w:drawing>
+      </w:r>
+    </w:p>
+    <w:p>
+      <w:pPr>
+        <w:jc w:val="center"/>
+        <w:keepNext/>
+      </w:pPr>
+      <w:r>
+        <w:drawing>
+          <wp:inline xmlns:a="http://schemas.openxmlformats.org/drawingml/2006/main" xmlns:pic="http://schemas.openxmlformats.org/drawingml/2006/picture">
+            <wp:extent cx="5040000" cy="2675769"/>
+            <wp:docPr id="3" name="Picture 3"/>
+            <wp:cNvGraphicFramePr>
+              <a:graphicFrameLocks noChangeAspect="1"/>
+            </wp:cNvGraphicFramePr>
+            <a:graphic>
+              <a:graphicData uri="http://schemas.openxmlformats.org/drawingml/2006/picture">
+                <pic:pic>
+                  <pic:nvPicPr>
+                    <pic:cNvPr id="0" name="screenshot_ver_simulink.png"/>
+                    <pic:cNvPicPr/>
+                  </pic:nvPicPr>
+                  <pic:blipFill>
+                    <a:blip r:embed="rId12"/>
+                    <a:stretch>
+                      <a:fillRect/>
+                    </a:stretch>
+                  </pic:blipFill>
+                  <pic:spPr>
+                    <a:xfrm>
+                      <a:off x="0" y="0"/>
+                      <a:ext cx="5040000" cy="2675769"/>
+                    </a:xfrm>
+                    <a:prstGeom prst="rect"/>
+                  </pic:spPr>
+                </pic:pic>
+              </a:graphicData>
+            </a:graphic>
+          </wp:inline>
+        </w:drawing>
+      </w:r>
+    </w:p>
+    <w:p>
+      <w:pPr>
+        <w:jc w:val="center"/>
+        <w:keepNext/>
+      </w:pPr>
+      <w:r>
+        <w:drawing>
+          <wp:inline xmlns:a="http://schemas.openxmlformats.org/drawingml/2006/main" xmlns:pic="http://schemas.openxmlformats.org/drawingml/2006/picture">
+            <wp:extent cx="5040000" cy="2675769"/>
+            <wp:docPr id="4" name="Picture 4"/>
+            <wp:cNvGraphicFramePr>
+              <a:graphicFrameLocks noChangeAspect="1"/>
+            </wp:cNvGraphicFramePr>
+            <a:graphic>
+              <a:graphicData uri="http://schemas.openxmlformats.org/drawingml/2006/picture">
+                <pic:pic>
+                  <pic:nvPicPr>
+                    <pic:cNvPr id="0" name="screenshot_ver_embeddedcoder.png"/>
+                    <pic:cNvPicPr/>
+                  </pic:nvPicPr>
+                  <pic:blipFill>
+                    <a:blip r:embed="rId13"/>
+                    <a:stretch>
+                      <a:fillRect/>
+                    </a:stretch>
+                  </pic:blipFill>
+                  <pic:spPr>
+                    <a:xfrm>
+                      <a:off x="0" y="0"/>
+                      <a:ext cx="5040000" cy="2675769"/>
+                    </a:xfrm>
+                    <a:prstGeom prst="rect"/>
+                  </pic:spPr>
+                </pic:pic>
+              </a:graphicData>
+            </a:graphic>
+          </wp:inline>
+        </w:drawing>
+      </w:r>
+    </w:p>
+    <w:p>
+      <w:pPr>
         <w:spacing w:after="120"/>
         <w:ind w:left="170"/>
       </w:pPr>
@@ -1687,7 +1882,7 @@
         <w:drawing>
           <wp:inline xmlns:a="http://schemas.openxmlformats.org/drawingml/2006/main" xmlns:pic="http://schemas.openxmlformats.org/drawingml/2006/picture">
             <wp:extent cx="5040000" cy="2036097"/>
-            <wp:docPr id="1" name="Picture 1"/>
+            <wp:docPr id="5" name="Picture 5"/>
             <wp:cNvGraphicFramePr>
               <a:graphicFrameLocks noChangeAspect="1"/>
             </wp:cNvGraphicFramePr>
@@ -1699,7 +1894,7 @@
                     <pic:cNvPicPr/>
                   </pic:nvPicPr>
                   <pic:blipFill>
-                    <a:blip r:embed="rId10"/>
+                    <a:blip r:embed="rId14"/>
                     <a:stretch>
                       <a:fillRect/>
                     </a:stretch>
@@ -3008,7 +3203,7 @@
         <w:drawing>
           <wp:inline xmlns:a="http://schemas.openxmlformats.org/drawingml/2006/main" xmlns:pic="http://schemas.openxmlformats.org/drawingml/2006/picture">
             <wp:extent cx="5040000" cy="2400778"/>
-            <wp:docPr id="2" name="Picture 2"/>
+            <wp:docPr id="6" name="Picture 6"/>
             <wp:cNvGraphicFramePr>
               <a:graphicFrameLocks noChangeAspect="1"/>
             </wp:cNvGraphicFramePr>
@@ -3020,7 +3215,7 @@
                     <pic:cNvPicPr/>
                   </pic:nvPicPr>
                   <pic:blipFill>
-                    <a:blip r:embed="rId11"/>
+                    <a:blip r:embed="rId15"/>
                     <a:stretch>
                       <a:fillRect/>
                     </a:stretch>
@@ -5652,7 +5847,7 @@
         <w:drawing>
           <wp:inline xmlns:a="http://schemas.openxmlformats.org/drawingml/2006/main" xmlns:pic="http://schemas.openxmlformats.org/drawingml/2006/picture">
             <wp:extent cx="5040000" cy="2115425"/>
-            <wp:docPr id="3" name="Picture 3"/>
+            <wp:docPr id="7" name="Picture 7"/>
             <wp:cNvGraphicFramePr>
               <a:graphicFrameLocks noChangeAspect="1"/>
             </wp:cNvGraphicFramePr>
@@ -5664,7 +5859,7 @@
                     <pic:cNvPicPr/>
                   </pic:nvPicPr>
                   <pic:blipFill>
-                    <a:blip r:embed="rId12"/>
+                    <a:blip r:embed="rId16"/>
                     <a:stretch>
                       <a:fillRect/>
                     </a:stretch>
@@ -5705,7 +5900,7 @@
         <w:drawing>
           <wp:inline xmlns:a="http://schemas.openxmlformats.org/drawingml/2006/main" xmlns:pic="http://schemas.openxmlformats.org/drawingml/2006/picture">
             <wp:extent cx="5040000" cy="2320481"/>
-            <wp:docPr id="4" name="Picture 4"/>
+            <wp:docPr id="8" name="Picture 8"/>
             <wp:cNvGraphicFramePr>
               <a:graphicFrameLocks noChangeAspect="1"/>
             </wp:cNvGraphicFramePr>
@@ -5717,7 +5912,7 @@
                     <pic:cNvPicPr/>
                   </pic:nvPicPr>
                   <pic:blipFill>
-                    <a:blip r:embed="rId13"/>
+                    <a:blip r:embed="rId17"/>
                     <a:stretch>
                       <a:fillRect/>
                     </a:stretch>

</xml_diff>